<commit_message>
Aggiorna il manuale del segretario per 3.26.158
</commit_message>
<xml_diff>
--- a/docs/manuale-segretario/Manuale_del_segretario.docx
+++ b/docs/manuale-segretario/Manuale_del_segretario.docx
@@ -23,7 +23,7 @@
         <w:widowControl/>
       </w:pPr>
       <w:r>
-        <w:t>Edizione del 18 settembre 2026 • Versione di riferimento 3.26.129</w:t>
+        <w:t>Edizione del 23 settembre 2026 • Versione di riferimento 3.26.158</w:t>
       </w:r>
     </w:p>
     <w:p>
@@ -1287,7 +1287,7 @@
         <w:widowControl/>
       </w:pPr>
       <w:r>
-        <w:t>2. Torna nel portale e avvia Sincronizza per l’evento.</w:t>
+        <w:t>2. Torna nel portale e aggiorna il riepilogo dell’evento. Il sistema controlla il foglio in background.</w:t>
       </w:r>
     </w:p>
     <w:p>
@@ -1295,7 +1295,7 @@
         <w:widowControl/>
       </w:pPr>
       <w:r>
-        <w:t>3. Leggi il confronto prima e dopo. Verifica persona, campo e valore proposto.</w:t>
+        <w:t>3. Se esistono modifiche o conflitti, accanto ad Apri compare Sincronizza. Se il foglio è già allineato, il comando resta nascosto.</w:t>
       </w:r>
     </w:p>
     <w:p>
@@ -1303,7 +1303,7 @@
         <w:widowControl/>
       </w:pPr>
       <w:r>
-        <w:t>4. Conferma le modifiche corrette e risolvi gli eventuali conflitti confrontando i dati aggiornati.</w:t>
+        <w:t>4. Avvia Sincronizza e leggi il confronto prima e dopo. Verifica persona, campo e valore proposto.</w:t>
       </w:r>
     </w:p>
     <w:p>
@@ -1311,7 +1311,7 @@
         <w:widowControl/>
       </w:pPr>
       <w:r>
-        <w:t>5. Controlla il risultato nel portale e poi l’allineamento del foglio.</w:t>
+        <w:t>5. Conferma le modifiche corrette e risolvi gli eventuali conflitti confrontando i dati aggiornati.</w:t>
       </w:r>
     </w:p>
     <w:p>
@@ -1319,7 +1319,15 @@
         <w:widowControl/>
       </w:pPr>
       <w:r>
-        <w:t>Gli identificativi delle righe e gli importi non sono campi da correggere nelle celle operative. Se la stessa informazione è stata modificata anche da un collega nel portale, non sovrascrivere senza il confronto.</w:t>
+        <w:t>6. Controlla il risultato nel portale e poi l’allineamento del foglio.</w:t>
+      </w:r>
+    </w:p>
+    <w:p>
+      <w:pPr>
+        <w:widowControl/>
+      </w:pPr>
+      <w:r>
+        <w:t>La regola vale anche per i fogli normalmente aperti in sola lettura: Sincronizza compare soltanto quando il controllo rileva qualcosa da confermare. La colonna N. contiene il progressivo visibile e non viene inviata al portale. Gli identificativi tecnici delle righe, gli importi e le colonne protette non sono campi da correggere. Se la stessa informazione è stata modificata anche da un collega nel portale, non sovrascrivere senza il confronto.</w:t>
       </w:r>
     </w:p>
     <w:p>
@@ -1530,7 +1538,7 @@
         <w:widowControl/>
       </w:pPr>
       <w:r>
-        <w:t>Versione di riferimento 3.26.129. Le procedure riprendono il codice del portale. Riesaminare il manuale quando cambiano funzioni, ruoli o regole organizzative.</w:t>
+        <w:t>Versione di riferimento 3.26.158. Le procedure riprendono il codice del portale. Riesaminare il manuale quando cambiano funzioni, ruoli o regole organizzative.</w:t>
       </w:r>
     </w:p>
     <w:sectPr>

</xml_diff>

<commit_message>
Prepara la distribuzione 3.26.234
</commit_message>
<xml_diff>
--- a/docs/manuale-segretario/Manuale_del_segretario.docx
+++ b/docs/manuale-segretario/Manuale_del_segretario.docx
@@ -23,14 +23,6 @@
         <w:widowControl/>
       </w:pPr>
       <w:r>
-        <w:t>Edizione del 23 settembre 2026 • Versione di riferimento 3.26.158</w:t>
-      </w:r>
-    </w:p>
-    <w:p>
-      <w:pPr>
-        <w:widowControl/>
-      </w:pPr>
-      <w:r>
         <w:t>Questo manuale accompagna chi prende in carico la segreteria: spiega come preparare un evento, gestire le iscrizioni, registrare i movimenti economici, comunicare con gli iscritti e chiudere il lavoro. Il criterio fondamentale è mantenere coerenti persone, posti e contabilità, verificando sempre l’esito delle operazioni.</w:t>
       </w:r>
     </w:p>
@@ -135,7 +127,7 @@
         <w:widowControl/>
       </w:pPr>
       <w:r>
-        <w:t>10   Chiusura eventi problemi e consegne</w:t>
+        <w:t>10   Chiusura eventi verifiche e consegne</w:t>
       </w:r>
     </w:p>
     <w:p>
@@ -183,13 +175,9 @@
       </w:r>
     </w:p>
     <w:p>
-      <w:r>
-        <w:br w:type="page"/>
-      </w:r>
-    </w:p>
-    <w:p>
       <w:pPr>
         <w:pStyle w:val="Heading1"/>
+        <w:pageBreakBefore/>
       </w:pPr>
       <w:r>
         <w:t>I criteri adottati nel portale</w:t>
@@ -280,7 +268,7 @@
         <w:pStyle w:val="Heading2"/>
       </w:pPr>
       <w:r>
-        <w:t>Le correzioni devono restare comprensibili</w:t>
+        <w:t>Le rettifiche economiche hanno un motivo registrato</w:t>
       </w:r>
     </w:p>
     <w:p>
@@ -308,13 +296,9 @@
       </w:r>
     </w:p>
     <w:p>
-      <w:r>
-        <w:br w:type="page"/>
-      </w:r>
-    </w:p>
-    <w:p>
       <w:pPr>
         <w:pStyle w:val="Heading1"/>
+        <w:pageBreakBefore/>
       </w:pPr>
       <w:r>
         <w:t>Accesso e responsabilità</w:t>
@@ -461,13 +445,9 @@
       </w:r>
     </w:p>
     <w:p>
-      <w:r>
-        <w:br w:type="page"/>
-      </w:r>
-    </w:p>
-    <w:p>
       <w:pPr>
         <w:pStyle w:val="Heading1"/>
+        <w:pageBreakBefore/>
       </w:pPr>
       <w:r>
         <w:t>Creazione e pubblicazione di un evento</w:t>
@@ -602,13 +582,9 @@
       </w:r>
     </w:p>
     <w:p>
-      <w:r>
-        <w:br w:type="page"/>
-      </w:r>
-    </w:p>
-    <w:p>
       <w:pPr>
         <w:pStyle w:val="Heading1"/>
+        <w:pageBreakBefore/>
       </w:pPr>
       <w:r>
         <w:t>Iscrizioni e lista di attesa</w:t>
@@ -772,13 +748,9 @@
       </w:r>
     </w:p>
     <w:p>
-      <w:r>
-        <w:br w:type="page"/>
-      </w:r>
-    </w:p>
-    <w:p>
       <w:pPr>
         <w:pStyle w:val="Heading1"/>
+        <w:pageBreakBefore/>
       </w:pPr>
       <w:r>
         <w:t>Dati personali servizi camere e presenze</w:t>
@@ -913,13 +885,9 @@
       </w:r>
     </w:p>
     <w:p>
-      <w:r>
-        <w:br w:type="page"/>
-      </w:r>
-    </w:p>
-    <w:p>
       <w:pPr>
         <w:pStyle w:val="Heading1"/>
+        <w:pageBreakBefore/>
       </w:pPr>
       <w:r>
         <w:t>Quote incassi rimborsi e storni</w:t>
@@ -1010,7 +978,7 @@
         <w:widowControl/>
       </w:pPr>
       <w:r>
-        <w:t>Per comprendere il riepilogo considera il dovuto aggiornato e quanto risulta effettivamente pagato al netto dei rimborsi e delle correzioni. La caparra è una parte del dovuto: averla versata non significa aver pagato tutto. Usa gli importi e le scadenze mostrati dal portale, senza ricostruire una nuova percentuale a mano.</w:t>
+        <w:t>Per comprendere il riepilogo considera il dovuto aggiornato e quanto risulta effettivamente pagato al netto di rimborsi e rettifiche. La caparra è una parte del dovuto: averla versata non significa aver pagato tutto. Usa gli importi e le scadenze mostrati dal portale, senza ricostruire una nuova percentuale a mano.</w:t>
       </w:r>
     </w:p>
     <w:p>
@@ -1062,13 +1030,9 @@
       </w:r>
     </w:p>
     <w:p>
-      <w:r>
-        <w:br w:type="page"/>
-      </w:r>
-    </w:p>
-    <w:p>
       <w:pPr>
         <w:pStyle w:val="Heading1"/>
+        <w:pageBreakBefore/>
       </w:pPr>
       <w:r>
         <w:t>Comunicazioni e consultazione degli iscritti</w:t>
@@ -1230,13 +1194,9 @@
       </w:r>
     </w:p>
     <w:p>
-      <w:r>
-        <w:br w:type="page"/>
-      </w:r>
-    </w:p>
-    <w:p>
       <w:pPr>
         <w:pStyle w:val="Heading1"/>
+        <w:pageBreakBefore/>
       </w:pPr>
       <w:r>
         <w:t>Fogli Google stampe ed esportazioni</w:t>
@@ -1387,16 +1347,12 @@
       </w:r>
     </w:p>
     <w:p>
+      <w:pPr>
+        <w:pStyle w:val="Heading1"/>
+        <w:pageBreakBefore/>
+      </w:pPr>
       <w:r>
-        <w:br w:type="page"/>
-      </w:r>
-    </w:p>
-    <w:p>
-      <w:pPr>
-        <w:pStyle w:val="Heading1"/>
-      </w:pPr>
-      <w:r>
-        <w:t>Chiusura eventi problemi e consegne</w:t>
+        <w:t>Chiusura eventi verifiche e consegne</w:t>
       </w:r>
     </w:p>
     <w:p>
@@ -1428,7 +1384,7 @@
         <w:widowControl/>
       </w:pPr>
       <w:r>
-        <w:t>Attendi Evento eliminato. In caso di errore usa Riprendi eliminazione. Il foglio conservato non si sincronizza più; il cestino Drive non equivale alla distruzione definitiva. Nella versione di riferimento l’eliminazione accoda anche avvisi agli iscritti attivi e all’organizzazione secondo la modalità email: controllala prima dell’azione.</w:t>
+        <w:t>Attendi Evento eliminato. In caso di errore usa Riprendi eliminazione. Il foglio conservato non si sincronizza più; il cestino Drive non equivale alla distruzione definitiva. L’eliminazione accoda anche avvisi agli iscritti attivi e all’organizzazione secondo la modalità email: controllala prima dell’azione.</w:t>
       </w:r>
     </w:p>
     <w:p>
@@ -1436,7 +1392,7 @@
         <w:pStyle w:val="Heading2"/>
       </w:pPr>
       <w:r>
-        <w:t>Affrontare i problemi più comuni</w:t>
+        <w:t>Situazioni operative da gestire</w:t>
       </w:r>
     </w:p>
     <w:p>
@@ -1530,7 +1486,7 @@
         <w:pStyle w:val="Heading2"/>
       </w:pPr>
       <w:r>
-        <w:t>Riferimenti per aggiornare il manuale</w:t>
+        <w:t>Aggiornamento del manuale</w:t>
       </w:r>
     </w:p>
     <w:p>
@@ -1538,7 +1494,7 @@
         <w:widowControl/>
       </w:pPr>
       <w:r>
-        <w:t>Versione di riferimento 3.26.158. Le procedure riprendono il codice del portale. Riesaminare il manuale quando cambiano funzioni, ruoli o regole organizzative.</w:t>
+        <w:t>Le procedure descrivono il portale operativo. Riesaminare questa guida quando cambiano funzioni, ruoli o regole organizzative.</w:t>
       </w:r>
     </w:p>
     <w:sectPr>

</xml_diff>